<commit_message>
Criteri: continuità del professionista, sostituzione del liquidatore, orientamenti Genova sul cram-down
Co-Authored-By: Claude Opus 5.5 <noreply@anthropic.com>
Claude-Session: https://claude.ai/code/session_01NPYDoU6nrtRE59is9BWqYg
</commit_message>
<xml_diff>
--- a/crisi-impresa/Criteri_Sovraindebitamento_per_procedura.docx
+++ b/crisi-impresa/Criteri_Sovraindebitamento_per_procedura.docx
@@ -2598,6 +2598,36 @@
           <w:sz w:val="22"/>
           <w:szCs w:val="22"/>
         </w:rPr>
+        <w:t xml:space="preserve">Continuità (art. 74 c.1):</w:t>
+      </w:r>
+      <w:r>
+        <w:rPr>
+          <w:rFonts w:ascii="Verdana" w:cs="Verdana" w:eastAsia="Verdana" w:hAnsi="Verdana"/>
+          <w:color w:val="1F2A37"/>
+          <w:sz w:val="22"/>
+          <w:szCs w:val="22"/>
+        </w:rPr>
+        <w:t xml:space="preserve"> il professionista anche forfettario e l’impresa minore possono continuare l’attività; la finanza esterna non è obbligatoria ma rafforza la proposta. Le rate di un leasing rinegoziato del bene strumentale possono entrare tra le spese incomprimibili per proseguire l’attività (Genova 2026). Una continuità senza cambiamenti nell’attività non basta a escludere il concordato, anche se l’Erario obietta che il debitore tornerà a non pagare le imposte (Genova 2024).</w:t>
+      </w:r>
+    </w:p>
+    <w:p>
+      <w:pPr>
+        <w:pStyle w:val="ListParagraph"/>
+        <w:numPr>
+          <w:ilvl w:val="0"/>
+          <w:numId w:val="2"/>
+        </w:numPr>
+        <w:spacing w:after="60" w:line="320"/>
+      </w:pPr>
+      <w:r>
+        <w:rPr>
+          <w:rFonts w:ascii="Verdana" w:cs="Verdana" w:eastAsia="Verdana" w:hAnsi="Verdana"/>
+          <w:b/>
+          <w:bCs/>
+          <w:color w:val="1F2A37"/>
+          <w:sz w:val="22"/>
+          <w:szCs w:val="22"/>
+        </w:rPr>
         <w:t xml:space="preserve">Concordato liquidatorio senza continuità (art. 74 c.2):</w:t>
       </w:r>
       <w:r>
@@ -3033,7 +3063,7 @@
           <w:sz w:val="22"/>
           <w:szCs w:val="22"/>
         </w:rPr>
-        <w:t xml:space="preserve"> se il voto del Fisco è determinante e la proposta per il Fisco è più conveniente della liquidazione, il giudice omologa lo stesso. Genova (2025) segue la lettera dell’art. 80 e non la “sterilizzazione” dell’art. 88 c.4 del concordato preventivo. La convenienza si è vista anche di misura: 21.879 € contro 20.661 €.</w:t>
+        <w:t xml:space="preserve"> se il voto del Fisco è determinante e la proposta per il Fisco è più conveniente della liquidazione, il giudice omologa lo stesso. A Genova gli orientamenti sono diversi. Nel 2024 un giudice ha “sterilizzato” il voto del Fisco e ricalcolato le classi senza di esso. Nel 2025 un altro giudice ha escluso la sterilizzazione dell’art. 88 c.4 e ha applicato la lettera dell’art. 80, omologando anche con una convenienza di misura (21.879 € contro 20.661 €).</w:t>
       </w:r>
     </w:p>
     <w:p>
@@ -3460,6 +3490,36 @@
           <w:szCs w:val="22"/>
         </w:rPr>
         <w:t xml:space="preserve"> di regola è il Gestore stesso (art. 270 c.2 lett. b). Savona lo autorizza ad accedere alle banche dati (artt. 155-quater e seguenti disp. att. c.p.c.).</w:t>
+      </w:r>
+    </w:p>
+    <w:p>
+      <w:pPr>
+        <w:pStyle w:val="ListParagraph"/>
+        <w:numPr>
+          <w:ilvl w:val="0"/>
+          <w:numId w:val="2"/>
+        </w:numPr>
+        <w:spacing w:after="60" w:line="320"/>
+      </w:pPr>
+      <w:r>
+        <w:rPr>
+          <w:rFonts w:ascii="Verdana" w:cs="Verdana" w:eastAsia="Verdana" w:hAnsi="Verdana"/>
+          <w:b/>
+          <w:bCs/>
+          <w:color w:val="1F2A37"/>
+          <w:sz w:val="22"/>
+          <w:szCs w:val="22"/>
+        </w:rPr>
+        <w:t xml:space="preserve">Sostituzione del liquidatore (Forlì 2026):</w:t>
+      </w:r>
+      <w:r>
+        <w:rPr>
+          <w:rFonts w:ascii="Verdana" w:cs="Verdana" w:eastAsia="Verdana" w:hAnsi="Verdana"/>
+          <w:color w:val="1F2A37"/>
+          <w:sz w:val="22"/>
+          <w:szCs w:val="22"/>
+        </w:rPr>
+        <w:t xml:space="preserve"> revoca d’urgenza se il liquidatore perde i requisiti, ad esempio per sospensione disciplinare dall’albo divenuta efficace. Il nuovo liquidatore verifica lo stato della procedura, si fa consegnare tutta la documentazione dal precedente, ne valuta la regolarità e riferisce al giudice. Nelle sentenze di apertura Forlì avverte che il mancato deposito delle relazioni semestrali è causa di revoca e incide sul compenso.</w:t>
       </w:r>
     </w:p>
     <w:p>

</xml_diff>